<commit_message>
Rewrite Component 1 as concise, submission-ready text
Tighten every section into short sequential paragraphs, drop working
tables and the unverified figures taken from the Road 7 machine
transcript, and simplify the figures to match the text.

Co-Authored-By: Claude Opus 5.5 <noreply@anthropic.com>
Claude-Session: https://claude.ai/code/session_01KiczVFn6ZCBZAZhfT9nXcg
</commit_message>
<xml_diff>
--- a/Component_1/Annex B - Rural and Urban Characteristics of Districts.docx
+++ b/Component_1/Annex B - Rural and Urban Characteristics of Districts.docx
@@ -13,7 +13,7 @@
     </w:p>
     <w:p>
       <w:pPr>
-        <w:spacing w:after="120" w:line="276"/>
+        <w:spacing w:after="120" w:before="100" w:line="276"/>
         <w:jc w:val="both"/>
       </w:pPr>
       <w:r>
@@ -375,7 +375,7 @@
     </w:tbl>
     <w:p>
       <w:pPr>
-        <w:spacing w:after="120" w:line="276"/>
+        <w:spacing w:after="120" w:before="100" w:line="276"/>
         <w:jc w:val="both"/>
       </w:pPr>
       <w:r>
@@ -1292,7 +1292,7 @@
     </w:p>
     <w:p>
       <w:pPr>
-        <w:spacing w:after="120" w:line="276"/>
+        <w:spacing w:after="120" w:before="100" w:line="276"/>
         <w:jc w:val="both"/>
       </w:pPr>
       <w:r>
@@ -9266,7 +9266,7 @@
     </w:p>
     <w:p>
       <w:pPr>
-        <w:spacing w:after="120" w:line="276"/>
+        <w:spacing w:after="120" w:before="100" w:line="276"/>
         <w:jc w:val="both"/>
       </w:pPr>
       <w:r>
@@ -14997,7 +14997,7 @@
     </w:p>
     <w:p>
       <w:pPr>
-        <w:spacing w:after="120" w:line="276"/>
+        <w:spacing w:after="120" w:before="100" w:line="276"/>
         <w:jc w:val="both"/>
       </w:pPr>
       <w:r>
@@ -22249,7 +22249,7 @@
     </w:p>
     <w:p>
       <w:pPr>
-        <w:spacing w:after="120" w:line="276"/>
+        <w:spacing w:after="120" w:before="100" w:line="276"/>
         <w:jc w:val="both"/>
       </w:pPr>
       <w:r>

</xml_diff>